<commit_message>
Harden TAIM workshop paper: narrow title, FPR caveat, accessibility, repo/data/AI disclosure
- Narrow title + abstract claim: 'TAIM does not transfer to this CICDDoS2019 benchmark'.
- Prominent operating-point caveat: the validation-selected 1% FPR cutoff produced an
  achieved test FPR of ~0.395 under shift (39x the 1% budget) on held-out folds; it is NOT a
  guaranteed operational 1% FPR. Same caveat in 4.1.
- Accessibility: table header rows marked w:tblHeader (repeat header on page break); widened
  the comparator column so method names fit on one line.
- Added: repository URL, dataset attribution + CC-BY-4.0 license, reproduction commands,
  AI-use disclosure, References (fixed Chuda -> Chuda diacritic). Fixed abstract typo.
- 4 pages, no orphan page; PDF generated via LibreOffice and every page visually inspected.
</commit_message>
<xml_diff>
--- a/TAIM_anonymous_workshop_paper.docx
+++ b/TAIM_anonymous_workshop_paper.docx
@@ -14,7 +14,7 @@
           <w:i w:val="0"/>
           <w:sz w:val="30"/>
         </w:rPr>
-        <w:t>Adaptive Time-Aware Thresholding Does Not Transfer to a Real DDoS Benchmark: A Temporal-Detector Mismatch</w:t>
+        <w:t>TAIM Does Not Transfer to the CICDDoS2019 Benchmark: A Temporal-Detector Mismatch</w:t>
       </w:r>
     </w:p>
     <w:p>
@@ -57,7 +57,7 @@
           <w:i w:val="0"/>
           <w:sz w:val="21"/>
         </w:rPr>
-        <w:t>Time-aware detectors aim to improve on snapshot anomaly detection by learning a per-device baseline over time and firing on sustained deviation. We test whether this holds on a real public DDoS benchmark (CICDDoS2019) under realistic distribution shift. Using strict family and day hold-outs, fold-isolation, and validation-calibrated operating points, we find that the adaptive detector TAIM is near-chance on unseen families (ROC-AUC ≈ 0.57, PR-AUC ≈ 0.05, F1 ≈ 0.05), while a supervised Random Forest baseline generalizes strongly (ROC-AUC ≈ 0.99, F1 ≈ 0.79, on 17 held-out families with ≥11 attack windows each). We trace this to a benchmark mismatch: CICDDoS2019 family bursts last only minutes, giving ≈3.2 windows per source IP, so there is too little per-device history for a temporal baseline to learn from. We argue this is a temporal-detector/benchmark mismatch rather than a detector deficiency, and that a longer-horizon trace is required for a fair evaluation.</w:t>
+        <w:t>We test whether a time-aware, adaptive detector transfers to a real public DDoS benchmark. On CICDDoS2019, under strict family and day hold-outs, fold-isolation and validation-calibrated operating points, the adaptive detector TAIM is near-chance on unseen families (ROC-AUC ≈ 0.57, PR-AUC ≈ 0.05, F1 ≈ 0.05), while a supervised Random Forest baseline generalizes strongly (ROC-AUC ≈ 0.99, F1 ≈ 0.79) on 17 held-out families with ≥11 attack windows each. The narrow claim: TAIM does not transfer to this CICDDoS2019 benchmark. We trace the failure to a temporal-detector/benchmark mismatch - CICDDoS2019 family bursts last only minutes, giving ≈3.2 windows per source IP, so there is too little per-device history for a temporal baseline to learn from. We argue this is a benchmark-transfer result, not a deployment-level claim, and that a longer-horizon trace is required for a fair evaluation.</w:t>
       </w:r>
     </w:p>
     <w:p>
@@ -274,9 +274,12 @@
         <w:gridCol w:w="1170"/>
       </w:tblGrid>
       <w:tr>
+        <w:trPr>
+          <w:tblHeader w:val="true"/>
+        </w:trPr>
         <w:tc>
           <w:tcPr>
-            <w:tcW w:type="dxa" w:w="2448"/>
+            <w:tcW w:type="dxa" w:w="2016"/>
             <w:shd w:fill="DDDDDD"/>
           </w:tcPr>
           <w:p>
@@ -297,7 +300,7 @@
         </w:tc>
         <w:tc>
           <w:tcPr>
-            <w:tcW w:type="dxa" w:w="1584"/>
+            <w:tcW w:type="dxa" w:w="1440"/>
             <w:shd w:fill="DDDDDD"/>
           </w:tcPr>
           <w:p>
@@ -318,7 +321,7 @@
         </w:tc>
         <w:tc>
           <w:tcPr>
-            <w:tcW w:type="dxa" w:w="1080"/>
+            <w:tcW w:type="dxa" w:w="864"/>
             <w:shd w:fill="DDDDDD"/>
           </w:tcPr>
           <w:p>
@@ -333,13 +336,13 @@
                 <w:i w:val="0"/>
                 <w:sz w:val="19"/>
               </w:rPr>
-              <w:t>precision</w:t>
+              <w:t>prec.</w:t>
             </w:r>
           </w:p>
         </w:tc>
         <w:tc>
           <w:tcPr>
-            <w:tcW w:type="dxa" w:w="1008"/>
+            <w:tcW w:type="dxa" w:w="936"/>
             <w:shd w:fill="DDDDDD"/>
           </w:tcPr>
           <w:p>
@@ -360,7 +363,7 @@
         </w:tc>
         <w:tc>
           <w:tcPr>
-            <w:tcW w:type="dxa" w:w="1440"/>
+            <w:tcW w:type="dxa" w:w="1368"/>
             <w:shd w:fill="DDDDDD"/>
           </w:tcPr>
           <w:p>
@@ -381,7 +384,7 @@
         </w:tc>
         <w:tc>
           <w:tcPr>
-            <w:tcW w:type="dxa" w:w="1440"/>
+            <w:tcW w:type="dxa" w:w="1368"/>
             <w:shd w:fill="DDDDDD"/>
           </w:tcPr>
           <w:p>
@@ -417,13 +420,13 @@
                 <w:i w:val="0"/>
                 <w:sz w:val="19"/>
               </w:rPr>
-              <w:t>recall@1%FPR</w:t>
+              <w:t>recall@1% FPR</w:t>
             </w:r>
           </w:p>
         </w:tc>
         <w:tc>
           <w:tcPr>
-            <w:tcW w:type="dxa" w:w="864"/>
+            <w:tcW w:type="dxa" w:w="720"/>
             <w:shd w:fill="DDDDDD"/>
           </w:tcPr>
           <w:p>
@@ -446,7 +449,7 @@
       <w:tr>
         <w:tc>
           <w:tcPr>
-            <w:tcW w:type="dxa" w:w="2448"/>
+            <w:tcW w:type="dxa" w:w="2016"/>
           </w:tcPr>
           <w:p>
             <w:pPr>
@@ -460,13 +463,13 @@
                 <w:i w:val="0"/>
                 <w:sz w:val="19"/>
               </w:rPr>
-              <w:t>RandomForest (supervised)</w:t>
+              <w:t>Random Forest (sup.)</w:t>
             </w:r>
           </w:p>
         </w:tc>
         <w:tc>
           <w:tcPr>
-            <w:tcW w:type="dxa" w:w="1584"/>
+            <w:tcW w:type="dxa" w:w="1440"/>
           </w:tcPr>
           <w:p>
             <w:pPr>
@@ -486,7 +489,7 @@
         </w:tc>
         <w:tc>
           <w:tcPr>
-            <w:tcW w:type="dxa" w:w="1080"/>
+            <w:tcW w:type="dxa" w:w="864"/>
           </w:tcPr>
           <w:p>
             <w:pPr>
@@ -506,7 +509,7 @@
         </w:tc>
         <w:tc>
           <w:tcPr>
-            <w:tcW w:type="dxa" w:w="1008"/>
+            <w:tcW w:type="dxa" w:w="936"/>
           </w:tcPr>
           <w:p>
             <w:pPr>
@@ -526,7 +529,7 @@
         </w:tc>
         <w:tc>
           <w:tcPr>
-            <w:tcW w:type="dxa" w:w="1440"/>
+            <w:tcW w:type="dxa" w:w="1368"/>
           </w:tcPr>
           <w:p>
             <w:pPr>
@@ -546,7 +549,7 @@
         </w:tc>
         <w:tc>
           <w:tcPr>
-            <w:tcW w:type="dxa" w:w="1440"/>
+            <w:tcW w:type="dxa" w:w="1368"/>
           </w:tcPr>
           <w:p>
             <w:pPr>
@@ -586,7 +589,7 @@
         </w:tc>
         <w:tc>
           <w:tcPr>
-            <w:tcW w:type="dxa" w:w="864"/>
+            <w:tcW w:type="dxa" w:w="720"/>
           </w:tcPr>
           <w:p>
             <w:pPr>
@@ -608,7 +611,7 @@
       <w:tr>
         <w:tc>
           <w:tcPr>
-            <w:tcW w:type="dxa" w:w="2448"/>
+            <w:tcW w:type="dxa" w:w="2016"/>
           </w:tcPr>
           <w:p>
             <w:pPr>
@@ -622,13 +625,13 @@
                 <w:i w:val="0"/>
                 <w:sz w:val="19"/>
               </w:rPr>
-              <w:t>IsolationForest (unsupervised)</w:t>
+              <w:t>Isolation Forest</w:t>
             </w:r>
           </w:p>
         </w:tc>
         <w:tc>
           <w:tcPr>
-            <w:tcW w:type="dxa" w:w="1584"/>
+            <w:tcW w:type="dxa" w:w="1440"/>
           </w:tcPr>
           <w:p>
             <w:pPr>
@@ -648,7 +651,7 @@
         </w:tc>
         <w:tc>
           <w:tcPr>
-            <w:tcW w:type="dxa" w:w="1080"/>
+            <w:tcW w:type="dxa" w:w="864"/>
           </w:tcPr>
           <w:p>
             <w:pPr>
@@ -668,7 +671,7 @@
         </w:tc>
         <w:tc>
           <w:tcPr>
-            <w:tcW w:type="dxa" w:w="1008"/>
+            <w:tcW w:type="dxa" w:w="936"/>
           </w:tcPr>
           <w:p>
             <w:pPr>
@@ -688,7 +691,7 @@
         </w:tc>
         <w:tc>
           <w:tcPr>
-            <w:tcW w:type="dxa" w:w="1440"/>
+            <w:tcW w:type="dxa" w:w="1368"/>
           </w:tcPr>
           <w:p>
             <w:pPr>
@@ -708,7 +711,7 @@
         </w:tc>
         <w:tc>
           <w:tcPr>
-            <w:tcW w:type="dxa" w:w="1440"/>
+            <w:tcW w:type="dxa" w:w="1368"/>
           </w:tcPr>
           <w:p>
             <w:pPr>
@@ -748,7 +751,7 @@
         </w:tc>
         <w:tc>
           <w:tcPr>
-            <w:tcW w:type="dxa" w:w="864"/>
+            <w:tcW w:type="dxa" w:w="720"/>
           </w:tcPr>
           <w:p>
             <w:pPr>
@@ -770,7 +773,7 @@
       <w:tr>
         <w:tc>
           <w:tcPr>
-            <w:tcW w:type="dxa" w:w="2448"/>
+            <w:tcW w:type="dxa" w:w="2016"/>
           </w:tcPr>
           <w:p>
             <w:pPr>
@@ -784,13 +787,13 @@
                 <w:i w:val="0"/>
                 <w:sz w:val="19"/>
               </w:rPr>
-              <w:t>Fixed-rule baseline</w:t>
+              <w:t>Fixed rule</w:t>
             </w:r>
           </w:p>
         </w:tc>
         <w:tc>
           <w:tcPr>
-            <w:tcW w:type="dxa" w:w="1584"/>
+            <w:tcW w:type="dxa" w:w="1440"/>
           </w:tcPr>
           <w:p>
             <w:pPr>
@@ -810,7 +813,7 @@
         </w:tc>
         <w:tc>
           <w:tcPr>
-            <w:tcW w:type="dxa" w:w="1080"/>
+            <w:tcW w:type="dxa" w:w="864"/>
           </w:tcPr>
           <w:p>
             <w:pPr>
@@ -830,7 +833,7 @@
         </w:tc>
         <w:tc>
           <w:tcPr>
-            <w:tcW w:type="dxa" w:w="1008"/>
+            <w:tcW w:type="dxa" w:w="936"/>
           </w:tcPr>
           <w:p>
             <w:pPr>
@@ -850,7 +853,7 @@
         </w:tc>
         <w:tc>
           <w:tcPr>
-            <w:tcW w:type="dxa" w:w="1440"/>
+            <w:tcW w:type="dxa" w:w="1368"/>
           </w:tcPr>
           <w:p>
             <w:pPr>
@@ -870,7 +873,7 @@
         </w:tc>
         <w:tc>
           <w:tcPr>
-            <w:tcW w:type="dxa" w:w="1440"/>
+            <w:tcW w:type="dxa" w:w="1368"/>
           </w:tcPr>
           <w:p>
             <w:pPr>
@@ -910,7 +913,7 @@
         </w:tc>
         <w:tc>
           <w:tcPr>
-            <w:tcW w:type="dxa" w:w="864"/>
+            <w:tcW w:type="dxa" w:w="720"/>
           </w:tcPr>
           <w:p>
             <w:pPr>
@@ -932,7 +935,7 @@
       <w:tr>
         <w:tc>
           <w:tcPr>
-            <w:tcW w:type="dxa" w:w="2448"/>
+            <w:tcW w:type="dxa" w:w="2016"/>
           </w:tcPr>
           <w:p>
             <w:pPr>
@@ -946,13 +949,13 @@
                 <w:i w:val="0"/>
                 <w:sz w:val="19"/>
               </w:rPr>
-              <w:t>TAIM (adaptive, fold-isolated)</w:t>
+              <w:t>TAIM (adaptive)</w:t>
             </w:r>
           </w:p>
         </w:tc>
         <w:tc>
           <w:tcPr>
-            <w:tcW w:type="dxa" w:w="1584"/>
+            <w:tcW w:type="dxa" w:w="1440"/>
           </w:tcPr>
           <w:p>
             <w:pPr>
@@ -972,7 +975,7 @@
         </w:tc>
         <w:tc>
           <w:tcPr>
-            <w:tcW w:type="dxa" w:w="1080"/>
+            <w:tcW w:type="dxa" w:w="864"/>
           </w:tcPr>
           <w:p>
             <w:pPr>
@@ -992,7 +995,7 @@
         </w:tc>
         <w:tc>
           <w:tcPr>
-            <w:tcW w:type="dxa" w:w="1008"/>
+            <w:tcW w:type="dxa" w:w="936"/>
           </w:tcPr>
           <w:p>
             <w:pPr>
@@ -1012,7 +1015,7 @@
         </w:tc>
         <w:tc>
           <w:tcPr>
-            <w:tcW w:type="dxa" w:w="1440"/>
+            <w:tcW w:type="dxa" w:w="1368"/>
           </w:tcPr>
           <w:p>
             <w:pPr>
@@ -1032,7 +1035,7 @@
         </w:tc>
         <w:tc>
           <w:tcPr>
-            <w:tcW w:type="dxa" w:w="1440"/>
+            <w:tcW w:type="dxa" w:w="1368"/>
           </w:tcPr>
           <w:p>
             <w:pPr>
@@ -1072,7 +1075,7 @@
         </w:tc>
         <w:tc>
           <w:tcPr>
-            <w:tcW w:type="dxa" w:w="864"/>
+            <w:tcW w:type="dxa" w:w="720"/>
           </w:tcPr>
           <w:p>
             <w:pPr>
@@ -1116,6 +1119,20 @@
           <w:rFonts w:ascii="Times New Roman" w:hAnsi="Times New Roman"/>
           <w:b w:val="0"/>
           <w:i w:val="0"/>
+          <w:sz w:val="21"/>
+        </w:rPr>
+        <w:t>Important operating-point caveat. The 1% FPR cutoff is a *validation-selected* threshold, not a guaranteed operational false-positive rate. When applied to the held-out test folds, the TAIM cutoff produced an achieved test FPR of ≈ 0.395 - over 39 times the 1% budget - because TAIM's score does not separate attacks under shift. The corresponding RF cutoff achieved FPR ≈ 0.005. These are test-set FPRs observed under shift, not a guarantee that the detector will operate at 1% FPR in deployment.</w:t>
+      </w:r>
+    </w:p>
+    <w:p>
+      <w:pPr>
+        <w:spacing w:after="120"/>
+      </w:pPr>
+      <w:r>
+        <w:rPr>
+          <w:rFonts w:ascii="Times New Roman" w:hAnsi="Times New Roman"/>
+          <w:b w:val="0"/>
+          <w:i w:val="0"/>
           <w:sz w:val="22"/>
         </w:rPr>
         <w:t>Table 2. Per held-out family, supervised Random Forest (fold-isolated):</w:t>
@@ -1135,6 +1152,9 @@
         <w:gridCol w:w="2340"/>
       </w:tblGrid>
       <w:tr>
+        <w:trPr>
+          <w:tblHeader w:val="true"/>
+        </w:trPr>
         <w:tc>
           <w:tcPr>
             <w:tcW w:type="dxa" w:w="2160"/>
@@ -2081,7 +2101,7 @@
           <w:i w:val="0"/>
           <w:sz w:val="22"/>
         </w:rPr>
-        <w:t>TAIM is temporal: it learns a per-device baseline over time and flags sustained deviation. On CICDDoS2019 the family bursts are short, giving roughly 3.2 windows per source IP, so there is essentially no per-device history for TAIM's baseline to learn from and no time-of-day regime to model. Even after fold isolation and validation calibration, TAIM's score orders attacks about as well as chance: its validation-calibrated recall@1%FPR cutoff achieves an actual FPR of ≈0.40, i.e. the score does not separate the classes. Isolation Forest and Random Forest are snapshot models that need no such history, so they are not similarly handicapped. We read this as a benchmark mismatch, not a general failure of temporal detection.</w:t>
+        <w:t>TAIM is temporal: it learns a per-device baseline over time and flags sustained deviation. On CICDDoS2019 the family bursts are short, giving roughly 3.2 windows per source IP, so there is essentially no per-device history for TAIM's baseline to learn from and no time-of-day regime to model. Even after fold isolation and validation calibration, TAIM's score orders attacks about as well as chance: its validation-calibrated recall@1%FPR cutoff achieved a test FPR of ≈ 0.395 on held-out folds, ≈39 times the 1% budget, i.e. the score does not separate the classes. Isolation Forest and Random Forest are snapshot models that need no such history, so they are not similarly handicapped. We read this as a benchmark mismatch, not a general failure of temporal detection.</w:t>
       </w:r>
     </w:p>
     <w:p>
@@ -2179,7 +2199,49 @@
           <w:i w:val="0"/>
           <w:sz w:val="26"/>
         </w:rPr>
-        <w:t>Reproduce</w:t>
+        <w:t>8. Repository, data, and reproduction</w:t>
+      </w:r>
+    </w:p>
+    <w:p>
+      <w:pPr>
+        <w:spacing w:after="120"/>
+      </w:pPr>
+      <w:r>
+        <w:rPr>
+          <w:rFonts w:ascii="Times New Roman" w:hAnsi="Times New Roman"/>
+          <w:b w:val="0"/>
+          <w:i w:val="0"/>
+          <w:sz w:val="20"/>
+        </w:rPr>
+        <w:t>Repository (anonymized for review): github.com/Farooq-Syed/taim. The evaluation entry point is src/real_cicddos_eval.py; the window builder is scripts/build_real_windows.py; the capture downloader is scripts/download_real_data.py. Frozen preprocessing and split definitions are documented in REAL_DATA_RESULTS.md.</w:t>
+      </w:r>
+    </w:p>
+    <w:p>
+      <w:pPr>
+        <w:spacing w:after="120"/>
+      </w:pPr>
+      <w:r>
+        <w:rPr>
+          <w:rFonts w:ascii="Times New Roman" w:hAnsi="Times New Roman"/>
+          <w:b w:val="0"/>
+          <w:i w:val="0"/>
+          <w:sz w:val="20"/>
+        </w:rPr>
+        <w:t>Data attribution and license. CICDDoS2019 (CC-BY-4.0), Canadian Institute for Cybersecurity, University of New Brunswick. Dataset page: https://www.unb.ca/cic/datasets/ddos-2019.html. The captures are public and used here for research evaluation only. This manuscript is released under the repository's Non-Commercial Personal-Use License.</w:t>
+      </w:r>
+    </w:p>
+    <w:p>
+      <w:pPr>
+        <w:spacing w:after="120"/>
+      </w:pPr>
+      <w:r>
+        <w:rPr>
+          <w:rFonts w:ascii="Times New Roman" w:hAnsi="Times New Roman"/>
+          <w:b w:val="0"/>
+          <w:i w:val="0"/>
+          <w:sz w:val="20"/>
+        </w:rPr>
+        <w:t>Reproduction commands.</w:t>
       </w:r>
     </w:p>
     <w:p>
@@ -2193,7 +2255,35 @@
           <w:i w:val="0"/>
           <w:sz w:val="19"/>
         </w:rPr>
-        <w:t>python scripts/download_real_data.py &amp;&amp; python scripts/build_real_windows.py --rows-per-family 1000000 --bucket-min 1 --output data/cicddos_real_windows.csv &amp;&amp; python src/real_cicddos_eval.py --input data/cicddos_real_windows.csv --split family &amp;&amp; python src/real_cicddos_eval.py --input data/cicddos_real_windows.csv --split day</w:t>
+        <w:t>python scripts/download_real_data.py; python scripts/build_real_windows.py --rows-per-family 1000000 --bucket-min 1 --output data/cicddos_real_windows.csv; python src/real_cicddos_eval.py --input data/cicddos_real_windows.csv --split family; python src/real_cicddos_eval.py --input data/cicddos_real_windows.csv --split day</w:t>
+      </w:r>
+    </w:p>
+    <w:p>
+      <w:pPr>
+        <w:spacing w:after="80"/>
+      </w:pPr>
+      <w:r>
+        <w:rPr>
+          <w:rFonts w:ascii="Times New Roman" w:hAnsi="Times New Roman"/>
+          <w:b/>
+          <w:i w:val="0"/>
+          <w:sz w:val="26"/>
+        </w:rPr>
+        <w:t>9. AI-use disclosure</w:t>
+      </w:r>
+    </w:p>
+    <w:p>
+      <w:pPr>
+        <w:spacing w:after="120"/>
+      </w:pPr>
+      <w:r>
+        <w:rPr>
+          <w:rFonts w:ascii="Times New Roman" w:hAnsi="Times New Roman"/>
+          <w:b w:val="0"/>
+          <w:i w:val="0"/>
+          <w:sz w:val="20"/>
+        </w:rPr>
+        <w:t>AI coding assistance was used during implementation and drafting. The author directed the research question, the benchmark evaluation protocol, the strict split and calibration design, the interpretation of the negative result, and reviewed and verified the final code and manuscript claims. AI assistance did not set the research direction or the claims.</w:t>
       </w:r>
     </w:p>
     <w:p>
@@ -2263,7 +2353,7 @@
           <w:i w:val="0"/>
           <w:sz w:val="19"/>
         </w:rPr>
-        <w:t>[4] Goldschmidt &amp; Chuda, Network Intrusion Datasets: A Survey, 2025. https://arxiv.org/abs/2502.06688</w:t>
+        <w:t>[4] Goldschmidt &amp; Chudá, Network Intrusion Datasets: A Survey, 2025. https://arxiv.org/abs/2502.06688</w:t>
       </w:r>
     </w:p>
     <w:p>

</xml_diff>

<commit_message>
Harden manuscript claims and reporting
</commit_message>
<xml_diff>
--- a/TAIM_anonymous_workshop_paper.docx
+++ b/TAIM_anonymous_workshop_paper.docx
@@ -34,6 +34,21 @@
     </w:p>
     <w:p>
       <w:pPr>
+        <w:spacing w:after="160"/>
+        <w:jc w:val="center"/>
+      </w:pPr>
+      <w:r>
+        <w:rPr>
+          <w:rFonts w:ascii="Times New Roman" w:hAnsi="Times New Roman"/>
+          <w:b/>
+          <w:i w:val="0"/>
+          <w:sz w:val="19"/>
+        </w:rPr>
+        <w:t>Audience and scope: a specialized cybersecurity measurement paper for intrusion-detection and security-ML venues, written to remain accessible to general cybersecurity reviewers. Machine learning is used to evaluate a network-defense question; no new classifier or deployment architecture is claimed.</w:t>
+      </w:r>
+    </w:p>
+    <w:p>
+      <w:pPr>
         <w:spacing w:after="80"/>
       </w:pPr>
       <w:r>
@@ -57,7 +72,7 @@
           <w:i w:val="0"/>
           <w:sz w:val="21"/>
         </w:rPr>
-        <w:t>We test whether a time-aware, adaptive detector transfers to a real public DDoS benchmark. On CICDDoS2019, under strict family and day hold-outs, fold-isolation and validation-calibrated operating points, the adaptive detector TAIM is near-chance on unseen families (ROC-AUC ≈ 0.57, PR-AUC ≈ 0.05, F1 ≈ 0.05), while a supervised Random Forest baseline generalizes strongly (ROC-AUC ≈ 0.99, F1 ≈ 0.79) on 17 held-out families with ≥11 attack windows each. The narrow claim: TAIM does not transfer to this CICDDoS2019 benchmark. We trace the failure to a temporal-detector/benchmark mismatch - CICDDoS2019 family bursts last only minutes, giving ≈3.2 windows per source IP, so there is too little per-device history for a temporal baseline to learn from. We argue this is a benchmark-transfer result, not a deployment-level claim, and that a longer-horizon trace is required for a fair evaluation.</w:t>
+        <w:t>We test whether a time-aware, adaptive detector transfers to a real public DDoS benchmark. On CICDDoS2019, under strict family and day hold-outs, fold-isolation and validation-calibrated operating points, the adaptive detector TAIM is near-chance on unseen families (ROC-AUC ≈ 0.57, PR-AUC ≈ 0.05, F1 ≈ 0.05), while a supervised Random Forest baseline retains high performance on this bounded held-out-family test (ROC-AUC ≈ 0.99, F1 ≈ 0.79) across 17 families with ≥11 attack windows each. The narrow claim: TAIM does not transfer to this CICDDoS2019 benchmark. We trace the failure to a temporal-detector/benchmark mismatch - CICDDoS2019 family bursts last only minutes, giving ≈3.2 windows per source IP, so there is too little per-device history for a temporal baseline to learn from. We argue this is a benchmark-transfer result, not a deployment-level claim, and that a longer-horizon trace is required for a fair evaluation.</w:t>
       </w:r>
     </w:p>
     <w:p>
@@ -99,7 +114,35 @@
           <w:i w:val="0"/>
           <w:sz w:val="22"/>
         </w:rPr>
-        <w:t>That claim is hard to test honestly because the detector is stateful: it must be warmed on training telemetry before it scores anything, and the warm-up must not see the evaluation windows. We therefore run the detector under a strict, fold-isolated protocol on a real public benchmark and ask a narrow question: does adaptive time-aware thresholding remain useful under realistic shift?</w:t>
+        <w:t>That claim is hard to test honestly because the detector is stateful: it must be warmed on training telemetry before it scores anything, and the warm-up must not see the evaluation windows. We therefore run the detector under a strict, fold-isolated protocol on a real public benchmark and ask a narrow question: does adaptive time-aware thresholding remain useful under family and capture-day shift?</w:t>
+      </w:r>
+    </w:p>
+    <w:p>
+      <w:pPr>
+        <w:spacing w:after="80"/>
+      </w:pPr>
+      <w:r>
+        <w:rPr>
+          <w:rFonts w:ascii="Times New Roman" w:hAnsi="Times New Roman"/>
+          <w:b/>
+          <w:i w:val="0"/>
+          <w:sz w:val="23"/>
+        </w:rPr>
+        <w:t>1.1 Reader guide: telemetry, metrics, and shifts</w:t>
+      </w:r>
+    </w:p>
+    <w:p>
+      <w:pPr>
+        <w:spacing w:after="120"/>
+      </w:pPr>
+      <w:r>
+        <w:rPr>
+          <w:rFonts w:ascii="Times New Roman" w:hAnsi="Times New Roman"/>
+          <w:b w:val="0"/>
+          <w:i w:val="0"/>
+          <w:sz w:val="20"/>
+        </w:rPr>
+        <w:t>A flow window summarizes one source IP's traffic during one minute; it is not packet payload or host telemetry. An attack family groups traffic generated by one named DDoS method, and a day hold-out tests a different capture day. Precision is the fraction of alerts that are attacks, recall is the fraction of attacks detected, and F1 is their harmonic mean on a 0-to-1 scale. ROC-AUC measures how often attacks rank above benign windows across thresholds; PR-AUC emphasizes ranking when attacks are uncommon. FPR is the fraction of benign windows incorrectly alerted, and a 95% confidence interval (CI) summarizes variation across held-out families. These benchmark measurements are not deployment guarantees.</w:t>
       </w:r>
     </w:p>
     <w:p>
@@ -209,9 +252,93 @@
           <w:rFonts w:ascii="Times New Roman" w:hAnsi="Times New Roman"/>
           <w:b/>
           <w:i w:val="0"/>
+          <w:sz w:val="23"/>
+        </w:rPr>
+        <w:t>3.1 Experimental system and evaluation architecture</w:t>
+      </w:r>
+    </w:p>
+    <w:p>
+      <w:pPr>
+        <w:spacing w:after="120"/>
+      </w:pPr>
+      <w:r>
+        <w:rPr>
+          <w:rFonts w:ascii="Times New Roman" w:hAnsi="Times New Roman"/>
+          <w:b w:val="0"/>
+          <w:i w:val="0"/>
+          <w:sz w:val="20"/>
+        </w:rPr>
+        <w:t>No network equipment or attacks were created for this study. The experiment begins at the released CICDDoS2019 flow-table boundary. Figure 1 separates the benchmark provider's captures from the author-controlled processing, splitting, model warm-up, calibration, and final scoring. Family/day metadata constructs the outer split but is not supplied as a predictive feature. TAIM may update only while warming on training telemetry; it is frozen before it sees the outer test fold.</w:t>
+      </w:r>
+    </w:p>
+    <w:p>
+      <w:pPr>
+        <w:spacing w:after="60"/>
+        <w:jc w:val="center"/>
+      </w:pPr>
+      <w:r>
+        <w:drawing>
+          <wp:inline xmlns:a="http://schemas.openxmlformats.org/drawingml/2006/main" xmlns:pic="http://schemas.openxmlformats.org/drawingml/2006/picture">
+            <wp:extent cx="5257800" cy="2851332"/>
+            <wp:docPr id="1" name="Picture 1" descr="CICDDoS2019 flow tables are converted to one-minute source-IP windows, split by family or day, used to warm and calibrate models without test labels, and then scored once on a frozen outer test fold." title="TAIM benchmark-transfer evaluation architecture"/>
+            <wp:cNvGraphicFramePr>
+              <a:graphicFrameLocks noChangeAspect="1"/>
+            </wp:cNvGraphicFramePr>
+            <a:graphic>
+              <a:graphicData uri="http://schemas.openxmlformats.org/drawingml/2006/picture">
+                <pic:pic>
+                  <pic:nvPicPr>
+                    <pic:cNvPr id="0" name="evaluation_architecture.png"/>
+                    <pic:cNvPicPr/>
+                  </pic:nvPicPr>
+                  <pic:blipFill>
+                    <a:blip r:embed="rId9"/>
+                    <a:stretch>
+                      <a:fillRect/>
+                    </a:stretch>
+                  </pic:blipFill>
+                  <pic:spPr>
+                    <a:xfrm>
+                      <a:off x="0" y="0"/>
+                      <a:ext cx="5257800" cy="2851332"/>
+                    </a:xfrm>
+                    <a:prstGeom prst="rect"/>
+                  </pic:spPr>
+                </pic:pic>
+              </a:graphicData>
+            </a:graphic>
+          </wp:inline>
+        </w:drawing>
+      </w:r>
+    </w:p>
+    <w:p>
+      <w:pPr>
+        <w:keepNext/>
+        <w:spacing w:after="60"/>
+        <w:jc w:val="center"/>
+      </w:pPr>
+      <w:r>
+        <w:rPr>
+          <w:rFonts w:ascii="Times New Roman" w:hAnsi="Times New Roman"/>
+          <w:b w:val="0"/>
+          <w:i/>
+          <w:sz w:val="18"/>
+        </w:rPr>
+        <w:t>Figure 1. Benchmark-provider data and the author-controlled, fold-isolated offline evaluation boundary.</w:t>
+      </w:r>
+    </w:p>
+    <w:p>
+      <w:pPr>
+        <w:spacing w:after="80"/>
+      </w:pPr>
+      <w:r>
+        <w:rPr>
+          <w:rFonts w:ascii="Times New Roman" w:hAnsi="Times New Roman"/>
+          <w:b/>
+          <w:i w:val="0"/>
           <w:sz w:val="26"/>
         </w:rPr>
-        <w:t>3.1 Methodological hardening</w:t>
+        <w:t>3.2 Methodological hardening</w:t>
       </w:r>
     </w:p>
     <w:p>
@@ -225,7 +352,7 @@
           <w:i w:val="0"/>
           <w:sz w:val="22"/>
         </w:rPr>
-        <w:t>Three evaluation habits were corrected before this result was trusted. First, fold isolation: a stateful detector cannot be run over the concatenated train+test frame and then have its test rows read, because its adaptive baseline would have processed the evaluation telemetry. TAIM is therefore run two-phase, warming on train and scoring test frozen. Second, in-sample calibration: a recall@FPR cutoff must be selected on a validation portion, not on the sequence whose scores are reported. Third, per-family support: a family-level result is only meaningful when each held-out family has enough attack windows, which required 1-minute buckets (coarser buckets left most families with a handful of windows). These are the standard pitfalls for any online detector.</w:t>
+        <w:t>Three evaluation habits were corrected before this result was trusted. First, fold isolation: a stateful detector cannot be run over the concatenated train+test frame and then have its test rows read, because its adaptive baseline would have processed the evaluation telemetry. TAIM is therefore run two-phase, warming on train and scoring test frozen. Second, in-sample calibration: a recall@FPR cutoff must be selected on a validation portion, not on the sequence whose scores are reported. Third, per-family support: a family-level result is only meaningful when each held-out family has enough attack windows, which required 1-minute buckets (coarser buckets left most families with a handful of windows). These are important evaluation pitfalls for this stateful detector.</w:t>
       </w:r>
     </w:p>
     <w:p>
@@ -264,14 +391,14 @@
         <w:tblLook w:firstColumn="1" w:firstRow="1" w:lastColumn="0" w:lastRow="0" w:noHBand="0" w:noVBand="1" w:val="04A0"/>
       </w:tblPr>
       <w:tblGrid>
-        <w:gridCol w:w="1170"/>
-        <w:gridCol w:w="1170"/>
-        <w:gridCol w:w="1170"/>
-        <w:gridCol w:w="1170"/>
-        <w:gridCol w:w="1170"/>
-        <w:gridCol w:w="1170"/>
-        <w:gridCol w:w="1170"/>
-        <w:gridCol w:w="1170"/>
+        <w:gridCol w:w="1224"/>
+        <w:gridCol w:w="1224"/>
+        <w:gridCol w:w="1224"/>
+        <w:gridCol w:w="1224"/>
+        <w:gridCol w:w="1224"/>
+        <w:gridCol w:w="1224"/>
+        <w:gridCol w:w="1224"/>
+        <w:gridCol w:w="1224"/>
       </w:tblGrid>
       <w:tr>
         <w:trPr>
@@ -294,7 +421,7 @@
                 <w:i w:val="0"/>
                 <w:sz w:val="19"/>
               </w:rPr>
-              <w:t>comparator</w:t>
+              <w:t>method</w:t>
             </w:r>
           </w:p>
         </w:tc>
@@ -603,7 +730,7 @@
                 <w:i w:val="0"/>
                 <w:sz w:val="19"/>
               </w:rPr>
-              <w:t>≈5</w:t>
+              <w:t>59.8</w:t>
             </w:r>
           </w:p>
         </w:tc>
@@ -765,7 +892,7 @@
                 <w:i w:val="0"/>
                 <w:sz w:val="19"/>
               </w:rPr>
-              <w:t>≈9</w:t>
+              <w:t>419.6</w:t>
             </w:r>
           </w:p>
         </w:tc>
@@ -927,7 +1054,7 @@
                 <w:i w:val="0"/>
                 <w:sz w:val="19"/>
               </w:rPr>
-              <w:t>≈11</w:t>
+              <w:t>1,091.6</w:t>
             </w:r>
           </w:p>
         </w:tc>
@@ -1089,13 +1216,53 @@
                 <w:i w:val="0"/>
                 <w:sz w:val="19"/>
               </w:rPr>
-              <w:t>≈81</w:t>
+              <w:t>813.7</w:t>
             </w:r>
           </w:p>
         </w:tc>
       </w:tr>
     </w:tbl>
-    <w:p/>
+    <w:p>
+      <w:pPr>
+        <w:keepNext/>
+        <w:spacing w:after="60"/>
+        <w:jc w:val="center"/>
+      </w:pPr>
+      <w:r>
+        <w:rPr>
+          <w:rFonts w:ascii="Times New Roman" w:hAnsi="Times New Roman"/>
+          <w:b w:val="0"/>
+          <w:i/>
+          <w:sz w:val="18"/>
+        </w:rPr>
+        <w:t>Table 1. Macro-average family-hold-out results across 17 unseen DDoS families; alerts are mean counts per held-out fold.</w:t>
+      </w:r>
+    </w:p>
+    <w:p>
+      <w:pPr>
+        <w:spacing w:after="120"/>
+        <w:ind w:left="173" w:right="115"/>
+      </w:pPr>
+      <w:r>
+        <w:rPr>
+          <w:rFonts w:ascii="Times New Roman" w:hAnsi="Times New Roman"/>
+          <w:b/>
+          <w:i w:val="0"/>
+          <w:color w:val="244A73"/>
+          <w:sz w:val="18"/>
+        </w:rPr>
+        <w:t xml:space="preserve">How to read this table. </w:t>
+      </w:r>
+      <w:r>
+        <w:rPr>
+          <w:rFonts w:ascii="Times New Roman" w:hAnsi="Times New Roman"/>
+          <w:b w:val="0"/>
+          <w:i w:val="0"/>
+          <w:sz w:val="18"/>
+        </w:rPr>
+        <w:t>The Random Forest row means that about 74% of its flagged windows were attacks (precision 0.742) and it found about 90% of attack windows (recall 0.902), producing F1 0.792. ROC-AUC 0.992 indicates strong ranking across thresholds. By comparison, TAIM's F1 0.052 and ROC-AUC 0.569 are near chance under this family shift.</w:t>
+      </w:r>
+    </w:p>
     <w:p>
       <w:pPr>
         <w:spacing w:after="120"/>
@@ -1121,7 +1288,7 @@
           <w:i w:val="0"/>
           <w:sz w:val="21"/>
         </w:rPr>
-        <w:t>Important operating-point caveat. The 1% FPR cutoff is a *validation-selected* threshold, not a guaranteed operational false-positive rate. When applied to the held-out test folds, the TAIM cutoff produced an achieved test FPR of ≈ 0.395 - over 39 times the 1% budget - because TAIM's score does not separate attacks under shift. The corresponding RF cutoff achieved FPR ≈ 0.005. These are test-set FPRs observed under shift, not a guarantee that the detector will operate at 1% FPR in deployment.</w:t>
+        <w:t>Important operating-point caveat. The 1% FPR cutoff is a validation-selected threshold, not a guaranteed operational false-positive rate. When applied to the held-out test folds, the TAIM cutoff produced an achieved test FPR of ≈ 0.395 - over 39 times the 1% budget - because TAIM's score does not separate attacks under shift. The corresponding RF cutoff achieved FPR ≈ 0.005. These are test-set FPRs observed under shift, not a guarantee that the detector will operate at 1% FPR in deployment.</w:t>
       </w:r>
     </w:p>
     <w:p>
@@ -1146,10 +1313,10 @@
         <w:tblLook w:firstColumn="1" w:firstRow="1" w:lastColumn="0" w:lastRow="0" w:noHBand="0" w:noVBand="1" w:val="04A0"/>
       </w:tblPr>
       <w:tblGrid>
-        <w:gridCol w:w="2340"/>
-        <w:gridCol w:w="2340"/>
-        <w:gridCol w:w="2340"/>
-        <w:gridCol w:w="2340"/>
+        <w:gridCol w:w="2448"/>
+        <w:gridCol w:w="2448"/>
+        <w:gridCol w:w="2448"/>
+        <w:gridCol w:w="2448"/>
       </w:tblGrid>
       <w:tr>
         <w:trPr>
@@ -2061,7 +2228,31 @@
         </w:tc>
       </w:tr>
     </w:tbl>
-    <w:p/>
+    <w:p>
+      <w:pPr>
+        <w:spacing w:after="120"/>
+        <w:ind w:left="173" w:right="115"/>
+      </w:pPr>
+      <w:r>
+        <w:rPr>
+          <w:rFonts w:ascii="Times New Roman" w:hAnsi="Times New Roman"/>
+          <w:b/>
+          <w:i w:val="0"/>
+          <w:color w:val="244A73"/>
+          <w:sz w:val="18"/>
+        </w:rPr>
+        <w:t xml:space="preserve">How to read this table. </w:t>
+      </w:r>
+      <w:r>
+        <w:rPr>
+          <w:rFonts w:ascii="Times New Roman" w:hAnsi="Times New Roman"/>
+          <w:b w:val="0"/>
+          <w:i w:val="0"/>
+          <w:sz w:val="18"/>
+        </w:rPr>
+        <w:t>The DrDoS_NTP row contains 172 held-out attack windows. Its F1 0.521 means the fixed attack decisions balanced precision and recall only moderately, while ROC-AUC 0.921 shows that the Random Forest scores still ranked most attacks above benign windows. The two values answer different questions about ranking and alert decisions.</w:t>
+      </w:r>
+    </w:p>
     <w:p>
       <w:pPr>
         <w:spacing w:after="120"/>
@@ -2129,7 +2320,7 @@
           <w:i w:val="0"/>
           <w:sz w:val="22"/>
         </w:rPr>
-        <w:t>Online, time-aware detection is a common framing for network intrusion detection, and adaptive baselining is attractive because it does not require labeled attacks. Empirical work on public DDoS/IDS benchmarks (CIC-IDS, CSE-CIC-IDS, UNSW-NB15) most often reports snapshot methods. Less reported is whether the *temporal* premise survives when the benchmark's attacks are short and family-isolated rather than spread over a long host history. Our result is a concrete counterexample: a temporal detector that is strong on long-horizon synthetic traffic is near-chance on a real benchmark whose per-device history is too short. This is the same synthetic-to-real gap documented for host anomaly detectors, observed here for an online network detector.</w:t>
+        <w:t>Online, time-aware detection is a common framing for network intrusion detection, and adaptive baselining is attractive because it does not require labeled attacks. Empirical work on public DDoS/IDS benchmarks (CIC-IDS, CSE-CIC-IDS, UNSW-NB15) most often reports snapshot methods. Less reported is whether the temporal premise survives when the benchmark's attacks are short and family-isolated rather than spread over a long host history. Our result is a concrete counterexample: a temporal detector that is strong on long-horizon synthetic traffic is near-chance on a real benchmark whose per-device history is too short. This is the same synthetic-to-real gap documented for host anomaly detectors, observed here for an online network detector.</w:t>
       </w:r>
     </w:p>
     <w:p>
@@ -2157,7 +2348,7 @@
           <w:i w:val="0"/>
           <w:sz w:val="22"/>
         </w:rPr>
-        <w:t>On real CICDDoS2019 with strict family/day hold-outs, fold isolation and validation calibration, adaptive time-aware thresholding (TAIM) does not remain useful under distribution shift: it is near-chance on unseen families while a supervised baseline generalizes strongly. The result is a benchmark-transfer finding: TAIM's per-device temporal baseline has no purchase on short, family-isolated bursts. A longer-horizon real trace (e.g. LANL or a multi-day capture) is the correct next test before any deployment claim.</w:t>
+        <w:t>On real CICDDoS2019 with strict family/day hold-outs, fold isolation and validation calibration, adaptive time-aware thresholding (TAIM) does not remain useful under the tested family/day shifts: it is near-chance on unseen families while a supervised baseline retains high performance on this bounded subset. The result is a benchmark-transfer finding: TAIM's per-device temporal baseline has no purchase on short, family-isolated bursts. A longer-horizon real trace (e.g. LANL or a multi-day capture) is the correct next test before any deployment claim.</w:t>
       </w:r>
     </w:p>
     <w:p>
@@ -2213,7 +2404,7 @@
           <w:i w:val="0"/>
           <w:sz w:val="20"/>
         </w:rPr>
-        <w:t>Repository (anonymized for review): github.com/Farooq-Syed/taim. The evaluation entry point is src/real_cicddos_eval.py; the window builder is scripts/build_real_windows.py; the capture downloader is scripts/download_real_data.py. Frozen preprocessing and split definitions are documented in REAL_DATA_RESULTS.md.</w:t>
+        <w:t>Repository URL: withheld from this manuscript for double-blind review and available through an anonymous artifact when venue policy permits. The evaluation entry point is src/real_cicddos_eval.py; the window builder is scripts/build_real_windows.py; the capture downloader is scripts/download_real_data.py. Frozen preprocessing and split definitions are documented in REAL_DATA_RESULTS.md.</w:t>
       </w:r>
     </w:p>
     <w:p>
@@ -2311,7 +2502,7 @@
           <w:i w:val="0"/>
           <w:sz w:val="19"/>
         </w:rPr>
-        <w:t>[1] CICDDoS2019 dataset, Canadian Institute for Cybersecurity, University of New Brunswick. https://www.unb.ca/cic/datasets/ddos-2019.html</w:t>
+        <w:t>[1] I. Sharafaldin et al. Developing Realistic Distributed Denial of Service (DDoS) Attack Dataset and Taxonomy. ICCST, 2019. doi:10.1109/CCST.2019.8888419.</w:t>
       </w:r>
     </w:p>
     <w:p>
@@ -2325,7 +2516,7 @@
           <w:i w:val="0"/>
           <w:sz w:val="19"/>
         </w:rPr>
-        <w:t>[2] Moustafa &amp; Slay, UNSW-NB15, MilCIS 2015. Sharafaldin et al., CIC-IDS, ICISSP 2018. (Public NIDS benchmarks.)</w:t>
+        <w:t>[2] Canadian Institute for Cybersecurity. CICDDoS2019 dataset, University of New Brunswick. https://www.unb.ca/cic/datasets/ddos-2019.html</w:t>
       </w:r>
     </w:p>
     <w:p>
@@ -2339,7 +2530,7 @@
           <w:i w:val="0"/>
           <w:sz w:val="19"/>
         </w:rPr>
-        <w:t>[3] Liu, Ting &amp; Zhou, Isolation Forest, ICDM 2008. Breunig et al., LOF, SIGMOD 2000. Breiman, Random Forests, ML 2001.</w:t>
+        <w:t>[3] F. T. Liu, K. M. Ting, and Z.-H. Zhou. Isolation Forest. ICDM, 2008.</w:t>
       </w:r>
     </w:p>
     <w:p>
@@ -2353,7 +2544,49 @@
           <w:i w:val="0"/>
           <w:sz w:val="19"/>
         </w:rPr>
-        <w:t>[4] Goldschmidt &amp; Chudá, Network Intrusion Datasets: A Survey, 2025. https://arxiv.org/abs/2502.06688</w:t>
+        <w:t>[4] L. Breiman. Random Forests. Machine Learning 45, 5-32, 2001.</w:t>
+      </w:r>
+    </w:p>
+    <w:p>
+      <w:pPr>
+        <w:spacing w:after="120"/>
+      </w:pPr>
+      <w:r>
+        <w:rPr>
+          <w:rFonts w:ascii="Times New Roman" w:hAnsi="Times New Roman"/>
+          <w:b w:val="0"/>
+          <w:i w:val="0"/>
+          <w:sz w:val="19"/>
+        </w:rPr>
+        <w:t>[5] J. Gama et al. A Survey on Concept Drift Adaptation. ACM Computing Surveys 46(4), 2014. doi:10.1145/2523813.</w:t>
+      </w:r>
+    </w:p>
+    <w:p>
+      <w:pPr>
+        <w:spacing w:after="120"/>
+      </w:pPr>
+      <w:r>
+        <w:rPr>
+          <w:rFonts w:ascii="Times New Roman" w:hAnsi="Times New Roman"/>
+          <w:b w:val="0"/>
+          <w:i w:val="0"/>
+          <w:sz w:val="19"/>
+        </w:rPr>
+        <w:t>[6] L. Bifet and R. Gavaldà. Learning from Time-Changing Data with Adaptive Windowing. SDM, 2007.</w:t>
+      </w:r>
+    </w:p>
+    <w:p>
+      <w:pPr>
+        <w:spacing w:after="120"/>
+      </w:pPr>
+      <w:r>
+        <w:rPr>
+          <w:rFonts w:ascii="Times New Roman" w:hAnsi="Times New Roman"/>
+          <w:b w:val="0"/>
+          <w:i w:val="0"/>
+          <w:sz w:val="19"/>
+        </w:rPr>
+        <w:t>[7] A. Hindy et al. A Taxonomy of Network Threats and the Effect of Current Datasets on Intrusion Detection Systems. IEEE Access 8, 2020.</w:t>
       </w:r>
     </w:p>
     <w:p>
@@ -2414,7 +2647,7 @@
     </w:p>
     <w:sectPr>
       <w:pgSz w:w="12240" w:h="15840"/>
-      <w:pgMar w:top="1440" w:right="1440" w:bottom="1440" w:left="1440" w:header="720" w:footer="720" w:gutter="0"/>
+      <w:pgMar w:top="1080" w:right="1224" w:bottom="1080" w:left="1224" w:header="720" w:footer="720" w:gutter="0"/>
       <w:cols w:space="720"/>
       <w:docGrid w:linePitch="360"/>
     </w:sectPr>

</xml_diff>